<commit_message>
Docs: split grouped tags into their distinct devices; §1 as tables
Per request:
- §0.3 polarity table (doc 04): split GADC into main door (01-03) vs gate
  (04-06), SADC into the 2oo3 set (01-03) vs 1oo2 set (04-05), locks into
  door (GADL-01/02) / gate (GADL-04/05) / service (SADL-01/02), keys into
  KEY-01 (ZCP) / KEY-02 (hutch) / KEY-03 (rack) with their distinct
  meanings, IT vs VT vs OXMON trip flags, RDMND vs RDMNR, and CON/SOL into
  source/RF and door/gate/service groups.
- §1 healthy starting point (doc 04): rewritten as force / reset / expect
  tables, one row per device with its own description.
- Glossary (doc 00) and doc 01 causes table updated to match (locks split,
  service-door sets split, the three keys listed separately).
- Regenerated all Word (.docx) files.

https://claude.ai/code/session_01B7Wzzk93u6jpLVLM53Apna
</commit_message>
<xml_diff>
--- a/B10E-PSS-Simulator/docs-word/00_TAG_GLOSSARY.docx
+++ b/B10E-PSS-Simulator/docs-word/00_TAG_GLOSSARY.docx
@@ -382,7 +382,7 @@
               <w:t>BL10E-PS-SADC-01</w:t>
             </w:r>
             <w:r>
-              <w:t>…</w:t>
+              <w:t xml:space="preserve">, </w:t>
             </w:r>
             <w:r>
               <w:rPr>
@@ -390,7 +390,18 @@
                 <w:color w:val="C7254E"/>
                 <w:sz w:val="19"/>
               </w:rPr>
-              <w:t>-05</w:t>
+              <w:t>-02</w:t>
+            </w:r>
+            <w:r>
+              <w:t xml:space="preserve">, </w:t>
+            </w:r>
+            <w:r>
+              <w:rPr>
+                <w:rFonts w:ascii="Consolas" w:hAnsi="Consolas"/>
+                <w:color w:val="C7254E"/>
+                <w:sz w:val="19"/>
+              </w:rPr>
+              <w:t>-03</w:t>
             </w:r>
           </w:p>
         </w:tc>
@@ -400,7 +411,7 @@
           </w:tcPr>
           <w:p>
             <w:r>
-              <w:t xml:space="preserve">"Closed" switches on the </w:t>
+              <w:t xml:space="preserve">Three "closed" switches on the </w:t>
             </w:r>
             <w:r>
               <w:rPr>
@@ -409,7 +420,7 @@
               <w:t>service / maintenance door</w:t>
             </w:r>
             <w:r>
-              <w:t xml:space="preserve"> ("Service Access Door Closed")</w:t>
+              <w:t xml:space="preserve"> (first set, voted 2oo3)</w:t>
             </w:r>
           </w:p>
         </w:tc>
@@ -446,29 +457,7 @@
                 <w:color w:val="C7254E"/>
                 <w:sz w:val="19"/>
               </w:rPr>
-              <w:t>BL10E-PS-GADL-01</w:t>
-            </w:r>
-            <w:r>
-              <w:t xml:space="preserve">, </w:t>
-            </w:r>
-            <w:r>
-              <w:rPr>
-                <w:rFonts w:ascii="Consolas" w:hAnsi="Consolas"/>
-                <w:color w:val="C7254E"/>
-                <w:sz w:val="19"/>
-              </w:rPr>
-              <w:t>-02</w:t>
-            </w:r>
-            <w:r>
-              <w:t xml:space="preserve">, </w:t>
-            </w:r>
-            <w:r>
-              <w:rPr>
-                <w:rFonts w:ascii="Consolas" w:hAnsi="Consolas"/>
-                <w:color w:val="C7254E"/>
-                <w:sz w:val="19"/>
-              </w:rPr>
-              <w:t>-04</w:t>
+              <w:t>BL10E-PS-SADC-04</w:t>
             </w:r>
             <w:r>
               <w:t xml:space="preserve">, </w:t>
@@ -489,16 +478,16 @@
           </w:tcPr>
           <w:p>
             <w:r>
-              <w:t xml:space="preserve">"Locked" switches that feel the </w:t>
+              <w:t xml:space="preserve">A second pair of "closed" switches on the </w:t>
             </w:r>
             <w:r>
               <w:rPr>
                 <w:b/>
               </w:rPr>
-              <w:t>bolt</w:t>
-            </w:r>
-            <w:r>
-              <w:t xml:space="preserve"> of the main door / gate ("General Access Door Locked")</w:t>
+              <w:t>service door</w:t>
+            </w:r>
+            <w:r>
+              <w:t xml:space="preserve"> (voted 1oo2)</w:t>
             </w:r>
           </w:p>
         </w:tc>
@@ -508,7 +497,7 @@
           </w:tcPr>
           <w:p>
             <w:r>
-              <w:t>door/gate is locked</w:t>
+              <w:t>door is shut</w:t>
             </w:r>
           </w:p>
         </w:tc>
@@ -518,7 +507,7 @@
           </w:tcPr>
           <w:p>
             <w:r>
-              <w:t>not locked</w:t>
+              <w:t>door is open</w:t>
             </w:r>
           </w:p>
         </w:tc>
@@ -535,7 +524,7 @@
                 <w:color w:val="C7254E"/>
                 <w:sz w:val="19"/>
               </w:rPr>
-              <w:t>BL10E-PS-SADL-01</w:t>
+              <w:t>BL10E-PS-GADL-01</w:t>
             </w:r>
             <w:r>
               <w:t xml:space="preserve">, </w:t>
@@ -562,10 +551,135 @@
               <w:rPr>
                 <w:b/>
               </w:rPr>
+              <w:t>main personnel door</w:t>
+            </w:r>
+          </w:p>
+        </w:tc>
+        <w:tc>
+          <w:tcPr>
+            <w:tcW w:type="dxa" w:w="2160"/>
+          </w:tcPr>
+          <w:p>
+            <w:r>
+              <w:t>door is locked</w:t>
+            </w:r>
+          </w:p>
+        </w:tc>
+        <w:tc>
+          <w:tcPr>
+            <w:tcW w:type="dxa" w:w="2160"/>
+          </w:tcPr>
+          <w:p>
+            <w:r>
+              <w:t>not locked</w:t>
+            </w:r>
+          </w:p>
+        </w:tc>
+      </w:tr>
+      <w:tr>
+        <w:tc>
+          <w:tcPr>
+            <w:tcW w:type="dxa" w:w="2160"/>
+          </w:tcPr>
+          <w:p>
+            <w:r>
+              <w:rPr>
+                <w:rFonts w:ascii="Consolas" w:hAnsi="Consolas"/>
+                <w:color w:val="C7254E"/>
+                <w:sz w:val="19"/>
+              </w:rPr>
+              <w:t>BL10E-PS-GADL-04</w:t>
+            </w:r>
+            <w:r>
+              <w:t xml:space="preserve">, </w:t>
+            </w:r>
+            <w:r>
+              <w:rPr>
+                <w:rFonts w:ascii="Consolas" w:hAnsi="Consolas"/>
+                <w:color w:val="C7254E"/>
+                <w:sz w:val="19"/>
+              </w:rPr>
+              <w:t>-05</w:t>
+            </w:r>
+          </w:p>
+        </w:tc>
+        <w:tc>
+          <w:tcPr>
+            <w:tcW w:type="dxa" w:w="2160"/>
+          </w:tcPr>
+          <w:p>
+            <w:r>
+              <w:t xml:space="preserve">"Locked" switches that feel the bolt of the </w:t>
+            </w:r>
+            <w:r>
+              <w:rPr>
+                <w:b/>
+              </w:rPr>
+              <w:t>entrance gate</w:t>
+            </w:r>
+          </w:p>
+        </w:tc>
+        <w:tc>
+          <w:tcPr>
+            <w:tcW w:type="dxa" w:w="2160"/>
+          </w:tcPr>
+          <w:p>
+            <w:r>
+              <w:t>gate is locked</w:t>
+            </w:r>
+          </w:p>
+        </w:tc>
+        <w:tc>
+          <w:tcPr>
+            <w:tcW w:type="dxa" w:w="2160"/>
+          </w:tcPr>
+          <w:p>
+            <w:r>
+              <w:t>not locked</w:t>
+            </w:r>
+          </w:p>
+        </w:tc>
+      </w:tr>
+      <w:tr>
+        <w:tc>
+          <w:tcPr>
+            <w:tcW w:type="dxa" w:w="2160"/>
+          </w:tcPr>
+          <w:p>
+            <w:r>
+              <w:rPr>
+                <w:rFonts w:ascii="Consolas" w:hAnsi="Consolas"/>
+                <w:color w:val="C7254E"/>
+                <w:sz w:val="19"/>
+              </w:rPr>
+              <w:t>BL10E-PS-SADL-01</w:t>
+            </w:r>
+            <w:r>
+              <w:t xml:space="preserve">, </w:t>
+            </w:r>
+            <w:r>
+              <w:rPr>
+                <w:rFonts w:ascii="Consolas" w:hAnsi="Consolas"/>
+                <w:color w:val="C7254E"/>
+                <w:sz w:val="19"/>
+              </w:rPr>
+              <w:t>-02</w:t>
+            </w:r>
+          </w:p>
+        </w:tc>
+        <w:tc>
+          <w:tcPr>
+            <w:tcW w:type="dxa" w:w="2160"/>
+          </w:tcPr>
+          <w:p>
+            <w:r>
+              <w:t xml:space="preserve">"Locked" switches that feel the bolt of the </w:t>
+            </w:r>
+            <w:r>
+              <w:rPr>
+                <w:b/>
+              </w:rPr>
               <w:t>service door</w:t>
-            </w:r>
-            <w:r>
-              <w:t xml:space="preserve"> ("Service Access Door Locked")</w:t>
             </w:r>
           </w:p>
         </w:tc>
@@ -3568,7 +3682,7 @@
               <w:t>BL10E-PS-SOL-01</w:t>
             </w:r>
             <w:r>
-              <w:t xml:space="preserve"> … </w:t>
+              <w:t xml:space="preserve">, </w:t>
             </w:r>
             <w:r>
               <w:rPr>
@@ -3576,7 +3690,7 @@
                 <w:color w:val="C7254E"/>
                 <w:sz w:val="19"/>
               </w:rPr>
-              <w:t>SOL-06</w:t>
+              <w:t>-02</w:t>
             </w:r>
           </w:p>
         </w:tc>
@@ -3592,7 +3706,13 @@
               <w:t>Lock solenoids</w:t>
             </w:r>
             <w:r>
-              <w:t xml:space="preserve"> — the bolts that lock the doors/gate</w:t>
+              <w:t xml:space="preserve"> (bolts) for the </w:t>
+            </w:r>
+            <w:r>
+              <w:rPr>
+                <w:b/>
+              </w:rPr>
+              <w:t>main personnel door</w:t>
             </w:r>
           </w:p>
         </w:tc>
@@ -3612,7 +3732,147 @@
           </w:tcPr>
           <w:p>
             <w:r>
-              <w:t>door unlocked</w:t>
+              <w:t>unlocked</w:t>
+            </w:r>
+          </w:p>
+        </w:tc>
+      </w:tr>
+      <w:tr>
+        <w:tc>
+          <w:tcPr>
+            <w:tcW w:type="dxa" w:w="2160"/>
+          </w:tcPr>
+          <w:p>
+            <w:r>
+              <w:rPr>
+                <w:rFonts w:ascii="Consolas" w:hAnsi="Consolas"/>
+                <w:color w:val="C7254E"/>
+                <w:sz w:val="19"/>
+              </w:rPr>
+              <w:t>BL10E-PS-SOL-03</w:t>
+            </w:r>
+            <w:r>
+              <w:t xml:space="preserve">, </w:t>
+            </w:r>
+            <w:r>
+              <w:rPr>
+                <w:rFonts w:ascii="Consolas" w:hAnsi="Consolas"/>
+                <w:color w:val="C7254E"/>
+                <w:sz w:val="19"/>
+              </w:rPr>
+              <w:t>-04</w:t>
+            </w:r>
+          </w:p>
+        </w:tc>
+        <w:tc>
+          <w:tcPr>
+            <w:tcW w:type="dxa" w:w="2160"/>
+          </w:tcPr>
+          <w:p>
+            <w:r>
+              <w:rPr>
+                <w:b/>
+              </w:rPr>
+              <w:t>Lock solenoids</w:t>
+            </w:r>
+            <w:r>
+              <w:t xml:space="preserve"> (bolts) for the </w:t>
+            </w:r>
+            <w:r>
+              <w:rPr>
+                <w:b/>
+              </w:rPr>
+              <w:t>entrance gate</w:t>
+            </w:r>
+          </w:p>
+        </w:tc>
+        <w:tc>
+          <w:tcPr>
+            <w:tcW w:type="dxa" w:w="2160"/>
+          </w:tcPr>
+          <w:p>
+            <w:r>
+              <w:t>gate locked</w:t>
+            </w:r>
+          </w:p>
+        </w:tc>
+        <w:tc>
+          <w:tcPr>
+            <w:tcW w:type="dxa" w:w="2160"/>
+          </w:tcPr>
+          <w:p>
+            <w:r>
+              <w:t>unlocked</w:t>
+            </w:r>
+          </w:p>
+        </w:tc>
+      </w:tr>
+      <w:tr>
+        <w:tc>
+          <w:tcPr>
+            <w:tcW w:type="dxa" w:w="2160"/>
+          </w:tcPr>
+          <w:p>
+            <w:r>
+              <w:rPr>
+                <w:rFonts w:ascii="Consolas" w:hAnsi="Consolas"/>
+                <w:color w:val="C7254E"/>
+                <w:sz w:val="19"/>
+              </w:rPr>
+              <w:t>BL10E-PS-SOL-05</w:t>
+            </w:r>
+            <w:r>
+              <w:t xml:space="preserve">, </w:t>
+            </w:r>
+            <w:r>
+              <w:rPr>
+                <w:rFonts w:ascii="Consolas" w:hAnsi="Consolas"/>
+                <w:color w:val="C7254E"/>
+                <w:sz w:val="19"/>
+              </w:rPr>
+              <w:t>-06</w:t>
+            </w:r>
+          </w:p>
+        </w:tc>
+        <w:tc>
+          <w:tcPr>
+            <w:tcW w:type="dxa" w:w="2160"/>
+          </w:tcPr>
+          <w:p>
+            <w:r>
+              <w:rPr>
+                <w:b/>
+              </w:rPr>
+              <w:t>Lock solenoids</w:t>
+            </w:r>
+            <w:r>
+              <w:t xml:space="preserve"> (bolts) for the </w:t>
+            </w:r>
+            <w:r>
+              <w:rPr>
+                <w:b/>
+              </w:rPr>
+              <w:t>service door</w:t>
+            </w:r>
+          </w:p>
+        </w:tc>
+        <w:tc>
+          <w:tcPr>
+            <w:tcW w:type="dxa" w:w="2160"/>
+          </w:tcPr>
+          <w:p>
+            <w:r>
+              <w:t>door locked</w:t>
+            </w:r>
+          </w:p>
+        </w:tc>
+        <w:tc>
+          <w:tcPr>
+            <w:tcW w:type="dxa" w:w="2160"/>
+          </w:tcPr>
+          <w:p>
+            <w:r>
+              <w:t>unlocked</w:t>
             </w:r>
           </w:p>
         </w:tc>

</xml_diff>

<commit_message>
Add hutch layout sketch; clarify the two enable-key locations
- Added docs/images/hutch_layout.png: a labelled sketch of the three ways
  into the hutch (main personnel door, entrance gate, service door) with
  each opening's closed switches (GADC/SADC), lock switches (GADL/SADL) and
  lock bolts (SOL), plus the light curtain (LCRx-01), the search buttons
  (ASB-01..04, ASBF-01), the ZCP panel (SCR-01, KEY-01, KEY-02) and the
  equipment rack (KEY-03). Embedded in the glossary (doc 00) and study pack.
- Clarified KEY-01 = ZCP (Zone Control Panel by the hutch) vs KEY-03 =
  equipment rack (cabinet / rack room, away from the hutch) across docs
  00 and 04; noted the trapped-key (one key, two locations) scheme.
- md2docx: added image embedding.

https://claude.ai/code/session_01B7Wzzk93u6jpLVLM53Apna
</commit_message>
<xml_diff>
--- a/B10E-PSS-Simulator/docs-word/00_TAG_GLOSSARY.docx
+++ b/B10E-PSS-Simulator/docs-word/00_TAG_GLOSSARY.docx
@@ -115,6 +115,189 @@
         <w:pStyle w:val="Heading2"/>
       </w:pPr>
       <w:r>
+        <w:t>A sketch of the doors, gate and switches</w:t>
+      </w:r>
+    </w:p>
+    <w:p>
+      <w:r>
+        <w:t xml:space="preserve">There are </w:t>
+      </w:r>
+      <w:r>
+        <w:rPr>
+          <w:b/>
+        </w:rPr>
+        <w:t>three ways into the hutch</w:t>
+      </w:r>
+      <w:r>
+        <w:t xml:space="preserve"> — the </w:t>
+      </w:r>
+      <w:r>
+        <w:rPr>
+          <w:b/>
+        </w:rPr>
+        <w:t>main personnel door</w:t>
+      </w:r>
+      <w:r>
+        <w:t xml:space="preserve">, the </w:t>
+      </w:r>
+      <w:r>
+        <w:rPr>
+          <w:b/>
+        </w:rPr>
+        <w:t>entrance gate</w:t>
+      </w:r>
+      <w:r>
+        <w:t xml:space="preserve">, and the </w:t>
+      </w:r>
+      <w:r>
+        <w:rPr>
+          <w:b/>
+        </w:rPr>
+        <w:t>service door</w:t>
+      </w:r>
+      <w:r>
+        <w:t xml:space="preserve"> — plus the search buttons inside. Each opening has its own switches. This picture shows them all with their tags; the tables below give the detail.</w:t>
+      </w:r>
+    </w:p>
+    <w:p>
+      <w:pPr>
+        <w:jc w:val="center"/>
+      </w:pPr>
+      <w:r>
+        <w:drawing>
+          <wp:inline xmlns:a="http://schemas.openxmlformats.org/drawingml/2006/main" xmlns:pic="http://schemas.openxmlformats.org/drawingml/2006/picture">
+            <wp:extent cx="5852160" cy="4041280"/>
+            <wp:docPr id="1" name="Picture 1"/>
+            <wp:cNvGraphicFramePr>
+              <a:graphicFrameLocks noChangeAspect="1"/>
+            </wp:cNvGraphicFramePr>
+            <a:graphic>
+              <a:graphicData uri="http://schemas.openxmlformats.org/drawingml/2006/picture">
+                <pic:pic>
+                  <pic:nvPicPr>
+                    <pic:cNvPr id="0" name="hutch_layout.png"/>
+                    <pic:cNvPicPr/>
+                  </pic:nvPicPr>
+                  <pic:blipFill>
+                    <a:blip r:embed="rId9"/>
+                    <a:stretch>
+                      <a:fillRect/>
+                    </a:stretch>
+                  </pic:blipFill>
+                  <pic:spPr>
+                    <a:xfrm>
+                      <a:off x="0" y="0"/>
+                      <a:ext cx="5852160" cy="4041280"/>
+                    </a:xfrm>
+                    <a:prstGeom prst="rect"/>
+                  </pic:spPr>
+                </pic:pic>
+              </a:graphicData>
+            </a:graphic>
+          </wp:inline>
+        </w:drawing>
+      </w:r>
+    </w:p>
+    <w:p>
+      <w:pPr>
+        <w:jc w:val="center"/>
+      </w:pPr>
+      <w:r>
+        <w:rPr>
+          <w:i/>
+          <w:sz w:val="18"/>
+        </w:rPr>
+        <w:t>Sketch of the B10E hutch showing the main personnel door (GADC-01/02/03, GADL-01/02, SOL-01/02), the entrance gate (GADC-04/05/06, GADL-04/05, SOL-03/04) and the service door (SADC-01..05, SADL-01/02, SOL-05/06), with the light curtain LCRx-01, the search buttons ASB-01..04 and ASBF-01, the ZCP panel (SCR-01, KEY-01, KEY-02) and the equipment rack (KEY-03).</w:t>
+      </w:r>
+    </w:p>
+    <w:p>
+      <w:pPr>
+        <w:pStyle w:val="ListBullet"/>
+      </w:pPr>
+      <w:r>
+        <w:rPr>
+          <w:b/>
+        </w:rPr>
+        <w:t>Closed switch</w:t>
+      </w:r>
+      <w:r>
+        <w:t xml:space="preserve"> = senses the door/gate is shut (e.g. </w:t>
+      </w:r>
+      <w:r>
+        <w:rPr>
+          <w:rFonts w:ascii="Consolas" w:hAnsi="Consolas"/>
+          <w:color w:val="C7254E"/>
+          <w:sz w:val="19"/>
+        </w:rPr>
+        <w:t>GADC-01</w:t>
+      </w:r>
+      <w:r>
+        <w:t>).</w:t>
+      </w:r>
+    </w:p>
+    <w:p>
+      <w:pPr>
+        <w:pStyle w:val="ListBullet"/>
+      </w:pPr>
+      <w:r>
+        <w:rPr>
+          <w:b/>
+        </w:rPr>
+        <w:t>Locked switch</w:t>
+      </w:r>
+      <w:r>
+        <w:t xml:space="preserve"> = senses the bolt has gone in (e.g. </w:t>
+      </w:r>
+      <w:r>
+        <w:rPr>
+          <w:rFonts w:ascii="Consolas" w:hAnsi="Consolas"/>
+          <w:color w:val="C7254E"/>
+          <w:sz w:val="19"/>
+        </w:rPr>
+        <w:t>GADL-01</w:t>
+      </w:r>
+      <w:r>
+        <w:t>).</w:t>
+      </w:r>
+    </w:p>
+    <w:p>
+      <w:pPr>
+        <w:pStyle w:val="ListBullet"/>
+      </w:pPr>
+      <w:r>
+        <w:rPr>
+          <w:b/>
+        </w:rPr>
+        <w:t>Lock bolt</w:t>
+      </w:r>
+      <w:r>
+        <w:t xml:space="preserve"> = the output solenoid that actually locks it (e.g. </w:t>
+      </w:r>
+      <w:r>
+        <w:rPr>
+          <w:rFonts w:ascii="Consolas" w:hAnsi="Consolas"/>
+          <w:color w:val="C7254E"/>
+          <w:sz w:val="19"/>
+        </w:rPr>
+        <w:t>SOL-01</w:t>
+      </w:r>
+      <w:r>
+        <w:t>).</w:t>
+      </w:r>
+    </w:p>
+    <w:p>
+      <w:r>
+        <w:rPr>
+          <w:color w:val="BBBBBB"/>
+        </w:rPr>
+        <w:t>__________________________________________________</w:t>
+      </w:r>
+    </w:p>
+    <w:p>
+      <w:pPr>
+        <w:pStyle w:val="Heading2"/>
+      </w:pPr>
+      <w:r>
         <w:t>A. Inputs — the doors and gates (position switches)</w:t>
       </w:r>
     </w:p>
@@ -810,7 +993,16 @@
               <w:t>Electron-source enable key</w:t>
             </w:r>
             <w:r>
-              <w:t xml:space="preserve"> at the control panel (ZCP)</w:t>
+              <w:t xml:space="preserve"> at the </w:t>
+            </w:r>
+            <w:r>
+              <w:rPr>
+                <w:b/>
+              </w:rPr>
+              <w:t>ZCP</w:t>
+            </w:r>
+            <w:r>
+              <w:t xml:space="preserve"> (Zone Control Panel — the local safety panel on/by the hutch wall)</w:t>
             </w:r>
           </w:p>
         </w:tc>
@@ -912,7 +1104,16 @@
               <w:t>Electron-source enable key</w:t>
             </w:r>
             <w:r>
-              <w:t xml:space="preserve"> at the equipment rack</w:t>
+              <w:t xml:space="preserve"> at the </w:t>
+            </w:r>
+            <w:r>
+              <w:rPr>
+                <w:b/>
+              </w:rPr>
+              <w:t>equipment rack</w:t>
+            </w:r>
+            <w:r>
+              <w:t xml:space="preserve"> (the equipment cabinet / rack room, away from the hutch). The same enable key is held at the ZCP during the search, released once the beam is on, then carried to this rack</w:t>
             </w:r>
           </w:p>
         </w:tc>

</xml_diff>

<commit_message>
Sketch: fix overlapping boxes; add 'what each opening is for'
- Redrew docs/images/hutch_layout.png with the door/gate/service callouts,
  the ZCP panel and the equipment rack spaced out (no more overlap), and a
  dotted 'key carried' arrow showing the trapped-key move ZCP -> rack.
- Added a 'What each opening is for' note under the sketch in doc 00
  explaining the purpose of the main door, the gate and the service door.

https://claude.ai/code/session_01B7Wzzk93u6jpLVLM53Apna
</commit_message>
<xml_diff>
--- a/B10E-PSS-Simulator/docs-word/00_TAG_GLOSSARY.docx
+++ b/B10E-PSS-Simulator/docs-word/00_TAG_GLOSSARY.docx
@@ -166,7 +166,7 @@
       <w:r>
         <w:drawing>
           <wp:inline xmlns:a="http://schemas.openxmlformats.org/drawingml/2006/main" xmlns:pic="http://schemas.openxmlformats.org/drawingml/2006/picture">
-            <wp:extent cx="5852160" cy="4041280"/>
+            <wp:extent cx="5852160" cy="3911342"/>
             <wp:docPr id="1" name="Picture 1"/>
             <wp:cNvGraphicFramePr>
               <a:graphicFrameLocks noChangeAspect="1"/>
@@ -187,7 +187,7 @@
                   <pic:spPr>
                     <a:xfrm>
                       <a:off x="0" y="0"/>
-                      <a:ext cx="5852160" cy="4041280"/>
+                      <a:ext cx="5852160" cy="3911342"/>
                     </a:xfrm>
                     <a:prstGeom prst="rect"/>
                   </pic:spPr>
@@ -283,6 +283,216 @@
       </w:r>
       <w:r>
         <w:t>).</w:t>
+      </w:r>
+    </w:p>
+    <w:p>
+      <w:pPr>
+        <w:pStyle w:val="Heading3"/>
+      </w:pPr>
+      <w:r>
+        <w:t>What each opening is for</w:t>
+      </w:r>
+    </w:p>
+    <w:p>
+      <w:pPr>
+        <w:pStyle w:val="ListBullet"/>
+      </w:pPr>
+      <w:r>
+        <w:rPr>
+          <w:b/>
+        </w:rPr>
+        <w:t>Main personnel door</w:t>
+      </w:r>
+      <w:r>
+        <w:t xml:space="preserve"> — the normal way people walk into the hutch to set up,</w:t>
+      </w:r>
+    </w:p>
+    <w:p>
+      <w:r>
+        <w:t xml:space="preserve">  align or maintain the experiment. Most entries use this door.</w:t>
+      </w:r>
+    </w:p>
+    <w:p>
+      <w:pPr>
+        <w:pStyle w:val="ListBullet"/>
+      </w:pPr>
+      <w:r>
+        <w:rPr>
+          <w:b/>
+        </w:rPr>
+        <w:t>Entrance gate</w:t>
+      </w:r>
+      <w:r>
+        <w:t xml:space="preserve"> — a second general‑access opening (for example a wider gate to</w:t>
+      </w:r>
+    </w:p>
+    <w:p>
+      <w:r>
+        <w:t xml:space="preserve">  bring equipment or trolleys in). It has its </w:t>
+      </w:r>
+      <w:r>
+        <w:rPr>
+          <w:b/>
+        </w:rPr>
+        <w:t>own</w:t>
+      </w:r>
+      <w:r>
+        <w:t xml:space="preserve"> safety function (SIF‑13) so   the gate and the door can be handled separately.</w:t>
+      </w:r>
+    </w:p>
+    <w:p>
+      <w:pPr>
+        <w:pStyle w:val="ListBullet"/>
+      </w:pPr>
+      <w:r>
+        <w:rPr>
+          <w:b/>
+        </w:rPr>
+        <w:t>Service door</w:t>
+      </w:r>
+      <w:r>
+        <w:t xml:space="preserve"> — a separate way in for service / maintenance staff to reach</w:t>
+      </w:r>
+    </w:p>
+    <w:p>
+      <w:r>
+        <w:t xml:space="preserve">  equipment, kept apart from the normal personnel route (its own function, SIF‑02).</w:t>
+      </w:r>
+    </w:p>
+    <w:p>
+      <w:r>
+        <w:t xml:space="preserve">All three do the </w:t>
+      </w:r>
+      <w:r>
+        <w:rPr>
+          <w:b/>
+        </w:rPr>
+        <w:t>same safety job</w:t>
+      </w:r>
+      <w:r>
+        <w:t>: control and prove entry so the hazard can never be on while a door is open or a person is inside. For every door the PLC:</w:t>
+      </w:r>
+    </w:p>
+    <w:p>
+      <w:pPr>
+        <w:pStyle w:val="ListNumber"/>
+      </w:pPr>
+      <w:r>
+        <w:t xml:space="preserve">lets authorised people in or out </w:t>
+      </w:r>
+      <w:r>
+        <w:rPr>
+          <w:b/>
+        </w:rPr>
+        <w:t>only when the hutch is OPEN</w:t>
+      </w:r>
+      <w:r>
+        <w:t xml:space="preserve"> (safe);</w:t>
+      </w:r>
+    </w:p>
+    <w:p>
+      <w:pPr>
+        <w:pStyle w:val="ListNumber"/>
+      </w:pPr>
+      <w:r>
+        <w:rPr>
+          <w:b/>
+        </w:rPr>
+        <w:t>locks</w:t>
+      </w:r>
+      <w:r>
+        <w:t xml:space="preserve"> it shut (the </w:t>
+      </w:r>
+      <w:r>
+        <w:rPr>
+          <w:rFonts w:ascii="Consolas" w:hAnsi="Consolas"/>
+          <w:color w:val="C7254E"/>
+          <w:sz w:val="19"/>
+        </w:rPr>
+        <w:t>SOL‑…</w:t>
+      </w:r>
+      <w:r>
+        <w:t xml:space="preserve"> bolts) while the hazard is armed, so nobody can</w:t>
+      </w:r>
+    </w:p>
+    <w:p>
+      <w:r>
+        <w:t xml:space="preserve">   enter;</w:t>
+      </w:r>
+    </w:p>
+    <w:p>
+      <w:pPr>
+        <w:pStyle w:val="ListNumber"/>
+      </w:pPr>
+      <w:r>
+        <w:t xml:space="preserve">watches its </w:t>
+      </w:r>
+      <w:r>
+        <w:rPr>
+          <w:b/>
+        </w:rPr>
+        <w:t>closed</w:t>
+      </w:r>
+      <w:r>
+        <w:t xml:space="preserve"> switches (</w:t>
+      </w:r>
+      <w:r>
+        <w:rPr>
+          <w:rFonts w:ascii="Consolas" w:hAnsi="Consolas"/>
+          <w:color w:val="C7254E"/>
+          <w:sz w:val="19"/>
+        </w:rPr>
+        <w:t>GADC</w:t>
+      </w:r>
+      <w:r>
+        <w:t xml:space="preserve"> / </w:t>
+      </w:r>
+      <w:r>
+        <w:rPr>
+          <w:rFonts w:ascii="Consolas" w:hAnsi="Consolas"/>
+          <w:color w:val="C7254E"/>
+          <w:sz w:val="19"/>
+        </w:rPr>
+        <w:t>SADC</w:t>
+      </w:r>
+      <w:r>
+        <w:t>) — opening a door cuts the beam</w:t>
+      </w:r>
+    </w:p>
+    <w:p>
+      <w:r>
+        <w:t xml:space="preserve">   in milliseconds — and its </w:t>
+      </w:r>
+      <w:r>
+        <w:rPr>
+          <w:b/>
+        </w:rPr>
+        <w:t>locked</w:t>
+      </w:r>
+      <w:r>
+        <w:t xml:space="preserve"> switches (</w:t>
+      </w:r>
+      <w:r>
+        <w:rPr>
+          <w:rFonts w:ascii="Consolas" w:hAnsi="Consolas"/>
+          <w:color w:val="C7254E"/>
+          <w:sz w:val="19"/>
+        </w:rPr>
+        <w:t>GADL</w:t>
+      </w:r>
+      <w:r>
+        <w:t xml:space="preserve"> / </w:t>
+      </w:r>
+      <w:r>
+        <w:rPr>
+          <w:rFonts w:ascii="Consolas" w:hAnsi="Consolas"/>
+          <w:color w:val="C7254E"/>
+          <w:sz w:val="19"/>
+        </w:rPr>
+        <w:t>SADL</w:t>
+      </w:r>
+      <w:r>
+        <w:t>), which must prove    the bolt really went in before the beam is allowed on.</w:t>
       </w:r>
     </w:p>
     <w:p>

</xml_diff>

<commit_message>
Clarify the service door: 5 switches in two voting sets (2oo3 + 1oo2)
- Reworded the service-door callout in the sketch (no cryptic '+'): it is
  proved shut by 5 switches in two sets - SADC-01/02/03 (2oo3) and
  SADC-04/05 (1oo2); opening either set = 'door open'. Added a 2oo3/1oo2
  plain-language key to the sketch.
- Added a 'Why the service door shows two switch sets' explanation in doc 00.

https://claude.ai/code/session_01B7Wzzk93u6jpLVLM53Apna
</commit_message>
<xml_diff>
--- a/B10E-PSS-Simulator/docs-word/00_TAG_GLOSSARY.docx
+++ b/B10E-PSS-Simulator/docs-word/00_TAG_GLOSSARY.docx
@@ -496,6 +496,171 @@
       </w:r>
     </w:p>
     <w:p>
+      <w:pPr>
+        <w:pStyle w:val="Heading3"/>
+      </w:pPr>
+      <w:r>
+        <w:t>Why the service door shows two switch sets</w:t>
+      </w:r>
+    </w:p>
+    <w:p>
+      <w:r>
+        <w:t xml:space="preserve">The service access is proved shut by </w:t>
+      </w:r>
+      <w:r>
+        <w:rPr>
+          <w:b/>
+        </w:rPr>
+        <w:t>five</w:t>
+      </w:r>
+      <w:r>
+        <w:t xml:space="preserve"> "closed" switches (</w:t>
+      </w:r>
+      <w:r>
+        <w:rPr>
+          <w:rFonts w:ascii="Consolas" w:hAnsi="Consolas"/>
+          <w:color w:val="C7254E"/>
+          <w:sz w:val="19"/>
+        </w:rPr>
+        <w:t>SADC‑01</w:t>
+      </w:r>
+      <w:r>
+        <w:t xml:space="preserve"> … </w:t>
+      </w:r>
+      <w:r>
+        <w:rPr>
+          <w:rFonts w:ascii="Consolas" w:hAnsi="Consolas"/>
+          <w:color w:val="C7254E"/>
+          <w:sz w:val="19"/>
+        </w:rPr>
+        <w:t>SADC‑05</w:t>
+      </w:r>
+      <w:r>
+        <w:t xml:space="preserve">). The PLC does </w:t>
+      </w:r>
+      <w:r>
+        <w:rPr>
+          <w:b/>
+        </w:rPr>
+        <w:t>not</w:t>
+      </w:r>
+      <w:r>
+        <w:t xml:space="preserve"> vote all five together — it uses </w:t>
+      </w:r>
+      <w:r>
+        <w:rPr>
+          <w:b/>
+        </w:rPr>
+        <w:t>two independent sets</w:t>
+      </w:r>
+      <w:r>
+        <w:t xml:space="preserve">, and it counts the service access as "open" if </w:t>
+      </w:r>
+      <w:r>
+        <w:rPr>
+          <w:b/>
+        </w:rPr>
+        <w:t>either</w:t>
+      </w:r>
+      <w:r>
+        <w:t xml:space="preserve"> set says open:</w:t>
+      </w:r>
+    </w:p>
+    <w:p>
+      <w:pPr>
+        <w:pStyle w:val="ListBullet"/>
+      </w:pPr>
+      <w:r>
+        <w:rPr>
+          <w:b/>
+        </w:rPr>
+        <w:t>Set 1 — `SADC‑01`, `‑02`, `‑03`, voted 2oo3.</w:t>
+      </w:r>
+      <w:r>
+        <w:t xml:space="preserve"> "2oo3" means *two out of three*:</w:t>
+      </w:r>
+    </w:p>
+    <w:p>
+      <w:r>
+        <w:t xml:space="preserve">  the set only says "open" when at least </w:t>
+      </w:r>
+      <w:r>
+        <w:rPr>
+          <w:b/>
+        </w:rPr>
+        <w:t>2 of its 3</w:t>
+      </w:r>
+      <w:r>
+        <w:t xml:space="preserve"> switches agree. One switch   failing or going out of line cannot cause a false trip — this set is   </w:t>
+      </w:r>
+      <w:r>
+        <w:rPr>
+          <w:b/>
+        </w:rPr>
+        <w:t>fault‑tolerant</w:t>
+      </w:r>
+      <w:r>
+        <w:t>.</w:t>
+      </w:r>
+    </w:p>
+    <w:p>
+      <w:pPr>
+        <w:pStyle w:val="ListBullet"/>
+      </w:pPr>
+      <w:r>
+        <w:rPr>
+          <w:b/>
+        </w:rPr>
+        <w:t>Set 2 — `SADC‑04`, `‑05`, voted 1oo2.</w:t>
+      </w:r>
+      <w:r>
+        <w:t xml:space="preserve"> "1oo2" means *one out of two*: </w:t>
+      </w:r>
+      <w:r>
+        <w:rPr>
+          <w:b/>
+        </w:rPr>
+        <w:t>either</w:t>
+      </w:r>
+    </w:p>
+    <w:p>
+      <w:r>
+        <w:t xml:space="preserve">  switch on its own is enough to say "open" — this set is </w:t>
+      </w:r>
+      <w:r>
+        <w:rPr>
+          <w:b/>
+        </w:rPr>
+        <w:t>more sensitive</w:t>
+      </w:r>
+      <w:r>
+        <w:t>.</w:t>
+      </w:r>
+    </w:p>
+    <w:p>
+      <w:r>
+        <w:t xml:space="preserve">This is typically because the service entry has </w:t>
+      </w:r>
+      <w:r>
+        <w:rPr>
+          <w:b/>
+        </w:rPr>
+        <w:t>two leaves</w:t>
+      </w:r>
+      <w:r>
+        <w:t xml:space="preserve"> (for example an outer and an inner door), each with its own switches. Whichever set opens, safety function </w:t>
+      </w:r>
+      <w:r>
+        <w:rPr>
+          <w:b/>
+        </w:rPr>
+        <w:t>SIF‑02</w:t>
+      </w:r>
+      <w:r>
+        <w:t xml:space="preserve"> removes the electron source. (The two sets are the C&amp;E "Group C" and "Group D".)</w:t>
+      </w:r>
+    </w:p>
+    <w:p>
       <w:r>
         <w:rPr>
           <w:color w:val="BBBBBB"/>

</xml_diff>